<commit_message>
Update About bio: Gal built the atlas as a gift to his mom.
Co-authored-by: Cursor <cursoragent@cursor.com>
</commit_message>
<xml_diff>
--- a/data/raw/1-About.docx
+++ b/data/raw/1-About.docx
@@ -1257,7 +1257,16 @@
         </w:rPr>
       </w:pPr>
       <w:r>
-        <w:t>Dr. Gal Cohensius is a data scientist with a PhD in Game Theory and AI from the Technion. He designed and built this online atlas and keeps it updated.</w:t>
+        <w:t xml:space="preserve">Dr. Gal Cohensius is a data scientist with a PhD in Game Theory and AI from the Technion. He designed and built this online atlas </w:t>
+      </w:r>
+      <w:r>
+        <w:rPr>
+          <w:lang w:val="en-US"/>
+        </w:rPr>
+        <w:t>as a gift to his mom</w:t>
+      </w:r>
+      <w:r>
+        <w:t>.</w:t>
       </w:r>
     </w:p>
     <w:sectPr>
@@ -1921,6 +1930,7 @@
   <w:style w:type="character" w:default="1" w:styleId="DefaultParagraphFont">
     <w:name w:val="Default Paragraph Font"/>
     <w:uiPriority w:val="1"/>
+    <w:semiHidden/>
     <w:unhideWhenUsed/>
   </w:style>
   <w:style w:type="table" w:default="1" w:styleId="TableNormal">

</xml_diff>

<commit_message>
Simplify Gal About bio and link his name to his site.
Co-authored-by: Cursor <cursoragent@cursor.com>
</commit_message>
<xml_diff>
--- a/data/raw/1-About.docx
+++ b/data/raw/1-About.docx
@@ -1257,17 +1257,14 @@
         </w:rPr>
       </w:pPr>
       <w:r>
-        <w:t xml:space="preserve">Dr. Gal Cohensius is a data scientist with a PhD in Game Theory and AI from the Technion. He designed and built this online atlas </w:t>
-      </w:r>
-      <w:r>
-        <w:rPr>
-          <w:lang w:val="en-US"/>
-        </w:rPr>
-        <w:t>as a gift to his mom</w:t>
-      </w:r>
-      <w:r>
-        <w:t>.</w:t>
-      </w:r>
+        <w:t>Dr. Gal Cohensius is a data scientist with a PhD in Game Theory and AI from the Technion. He built this atlas as a gift to his mom.</w:t>
+      </w:r>
+      <w:r>
+        <w:rPr>
+          <w:lang w:val="en-US"/>
+        </w:rPr>
+      </w:r>
+      <w:r/>
     </w:p>
     <w:sectPr>
       <w:pgSz w:w="12240" w:h="15840"/>

</xml_diff>

<commit_message>
Polish About layout and use phylum colors on card hover.
Drop repeated Dr. names in collaborator bios, shorten section titles, and tint algae-index hover with each phylum accent.

Co-authored-by: Cursor <cursoragent@cursor.com>
</commit_message>
<xml_diff>
--- a/data/raw/1-About.docx
+++ b/data/raw/1-About.docx
@@ -917,7 +917,7 @@
           <w:bCs/>
           <w:lang w:val="en-US"/>
         </w:rPr>
-        <w:t>Tamar Zohary</w:t>
+        <w:t>Dr. Tamar Zohary</w:t>
       </w:r>
     </w:p>
     <w:p>
@@ -930,103 +930,87 @@
         <w:rPr>
           <w:lang w:val="en-US"/>
         </w:rPr>
-        <w:t xml:space="preserve">Dr. Tamar Zohary is an emeritus senior research scientist at the Kinneret Limnological Institute, Israel Oceanographic and Limnological Research, where she has been working for </w:t>
-      </w:r>
-      <w:r>
-        <w:rPr>
-          <w:lang w:val="en-US"/>
-        </w:rPr>
-        <w:t>more than</w:t>
-      </w:r>
-      <w:r>
-        <w:rPr>
-          <w:lang w:val="en-US"/>
-        </w:rPr>
-        <w:t xml:space="preserve"> 35 years, </w:t>
-      </w:r>
-      <w:r>
-        <w:rPr>
-          <w:lang w:val="en-US"/>
-        </w:rPr>
-        <w:t>during which she also</w:t>
-      </w:r>
-      <w:r>
-        <w:rPr>
-          <w:lang w:val="en-US"/>
-        </w:rPr>
-        <w:t xml:space="preserve"> </w:t>
-      </w:r>
-      <w:r>
-        <w:rPr>
-          <w:lang w:val="en-US"/>
-        </w:rPr>
-        <w:t>served as</w:t>
-      </w:r>
-      <w:r>
-        <w:rPr>
-          <w:lang w:val="en-US"/>
-        </w:rPr>
-        <w:t xml:space="preserve"> the Institute’s director for 10 years. Her research focuses on phytoplankton ecology, and she has been responsible for the monitoring of the Kinneret phytoplankton </w:t>
-      </w:r>
-      <w:r>
-        <w:rPr>
-          <w:lang w:val="en-US"/>
-        </w:rPr>
-        <w:t>from</w:t>
-      </w:r>
-      <w:r>
-        <w:rPr>
-          <w:lang w:val="en-US"/>
-        </w:rPr>
-        <w:t xml:space="preserve"> 1996 </w:t>
-      </w:r>
-      <w:r>
-        <w:rPr>
-          <w:lang w:val="en-US"/>
-        </w:rPr>
-        <w:t>till</w:t>
-      </w:r>
-      <w:r>
-        <w:rPr>
-          <w:lang w:val="en-US"/>
-        </w:rPr>
-        <w:t xml:space="preserve"> 202</w:t>
-      </w:r>
-      <w:r>
-        <w:rPr>
-          <w:lang w:val="en-US"/>
-        </w:rPr>
-        <w:t>4</w:t>
-      </w:r>
-      <w:r>
-        <w:rPr>
-          <w:lang w:val="en-US"/>
-        </w:rPr>
-        <w:t xml:space="preserve">. It has been her </w:t>
-      </w:r>
-      <w:r>
-        <w:rPr>
-          <w:lang w:val="en-US"/>
-        </w:rPr>
-        <w:t>vision</w:t>
-      </w:r>
-      <w:r>
-        <w:rPr>
-          <w:lang w:val="en-US"/>
-        </w:rPr>
-        <w:t xml:space="preserve"> for many years to create such an atlas, and now that she has retired, this dream is materializing, with the close assistance of her </w:t>
-      </w:r>
-      <w:r>
-        <w:rPr>
-          <w:lang w:val="en-US"/>
-        </w:rPr>
-        <w:t>dedicated and talented research assistant Alla Alster, and her innovative and inspiring</w:t>
-      </w:r>
-      <w:r>
-        <w:rPr>
-          <w:lang w:val="en-US"/>
-        </w:rPr>
-        <w:t xml:space="preserve"> son, Gal Cohensius.</w:t>
+        <w:t>An emeritus senior research scientist at the Kinneret Limnological Institute, Israel Oceanographic and Limnological Research, where she has been working for more than 35 years, during which she also served as the Institute’s director for 10 years. Her research focuses on phytoplankton ecology, and she has been responsible for the monitoring of the Kinneret phytoplankton from 1996 till 2024. It has been her vision for many years to create such an atlas, and now that she has retired, this dream is materializing, with the close assistance of her dedicated and talented research assistant Alla Alster, and her innovative and inspiring son, Gal Cohensius.</w:t>
+      </w:r>
+      <w:r>
+        <w:rPr>
+          <w:lang w:val="en-US"/>
+        </w:rPr>
+      </w:r>
+      <w:r>
+        <w:rPr>
+          <w:lang w:val="en-US"/>
+        </w:rPr>
+      </w:r>
+      <w:r>
+        <w:rPr>
+          <w:lang w:val="en-US"/>
+        </w:rPr>
+      </w:r>
+      <w:r>
+        <w:rPr>
+          <w:lang w:val="en-US"/>
+        </w:rPr>
+      </w:r>
+      <w:r>
+        <w:rPr>
+          <w:lang w:val="en-US"/>
+        </w:rPr>
+      </w:r>
+      <w:r>
+        <w:rPr>
+          <w:lang w:val="en-US"/>
+        </w:rPr>
+      </w:r>
+      <w:r>
+        <w:rPr>
+          <w:lang w:val="en-US"/>
+        </w:rPr>
+      </w:r>
+      <w:r>
+        <w:rPr>
+          <w:lang w:val="en-US"/>
+        </w:rPr>
+      </w:r>
+      <w:r>
+        <w:rPr>
+          <w:lang w:val="en-US"/>
+        </w:rPr>
+      </w:r>
+      <w:r>
+        <w:rPr>
+          <w:lang w:val="en-US"/>
+        </w:rPr>
+      </w:r>
+      <w:r>
+        <w:rPr>
+          <w:lang w:val="en-US"/>
+        </w:rPr>
+      </w:r>
+      <w:r>
+        <w:rPr>
+          <w:lang w:val="en-US"/>
+        </w:rPr>
+      </w:r>
+      <w:r>
+        <w:rPr>
+          <w:lang w:val="en-US"/>
+        </w:rPr>
+      </w:r>
+      <w:r>
+        <w:rPr>
+          <w:lang w:val="en-US"/>
+        </w:rPr>
+      </w:r>
+      <w:r>
+        <w:rPr>
+          <w:lang w:val="en-US"/>
+        </w:rPr>
+      </w:r>
+      <w:r>
+        <w:rPr>
+          <w:lang w:val="en-US"/>
+        </w:rPr>
       </w:r>
     </w:p>
     <w:p>
@@ -1083,7 +1067,7 @@
           <w:bCs/>
           <w:lang w:val="en-US"/>
         </w:rPr>
-        <w:t>Alla Alster</w:t>
+        <w:t>Dr. Alla Alster</w:t>
       </w:r>
     </w:p>
     <w:p>
@@ -1096,91 +1080,77 @@
         <w:rPr>
           <w:lang w:val="en-US"/>
         </w:rPr>
-        <w:t>Dr</w:t>
-      </w:r>
-      <w:r>
-        <w:rPr>
-          <w:lang w:val="en-US"/>
-        </w:rPr>
-        <w:t>.</w:t>
-      </w:r>
-      <w:r>
-        <w:rPr>
-          <w:lang w:val="en-US"/>
-        </w:rPr>
-        <w:t xml:space="preserve"> Alla Alster is an algal taxonomist working as a research assistant at the Kinneret Limnological Institute, Israel Oceanographic and Limnological Research</w:t>
-      </w:r>
-      <w:r>
-        <w:rPr>
-          <w:lang w:val="en-US"/>
-        </w:rPr>
-        <w:t xml:space="preserve"> since 2011</w:t>
-      </w:r>
-      <w:r>
-        <w:rPr>
-          <w:lang w:val="en-US"/>
-        </w:rPr>
-        <w:t xml:space="preserve">. She is the analyst conducting the </w:t>
-      </w:r>
-      <w:r>
-        <w:rPr>
-          <w:lang w:val="en-US"/>
-        </w:rPr>
-        <w:t xml:space="preserve">Kinneret </w:t>
-      </w:r>
-      <w:r>
-        <w:rPr>
-          <w:lang w:val="en-US"/>
-        </w:rPr>
-        <w:t>phytoplankton counts and measurements since January 2013</w:t>
-      </w:r>
-      <w:r>
-        <w:rPr>
-          <w:lang w:val="en-US"/>
-        </w:rPr>
-        <w:t>,</w:t>
-      </w:r>
-      <w:r>
-        <w:rPr>
-          <w:lang w:val="en-US"/>
-        </w:rPr>
-        <w:t xml:space="preserve"> has </w:t>
-      </w:r>
-      <w:r>
-        <w:rPr>
-          <w:lang w:val="en-US"/>
-        </w:rPr>
-        <w:t>taken</w:t>
-      </w:r>
-      <w:r>
-        <w:rPr>
-          <w:lang w:val="en-US"/>
-        </w:rPr>
-        <w:t xml:space="preserve"> </w:t>
-      </w:r>
-      <w:r>
-        <w:rPr>
-          <w:lang w:val="en-US"/>
-        </w:rPr>
-        <w:t xml:space="preserve">nearly </w:t>
-      </w:r>
-      <w:r>
-        <w:rPr>
-          <w:lang w:val="en-US"/>
-        </w:rPr>
-        <w:t>all the microscope photos presented in this atlas</w:t>
-      </w:r>
-      <w:r>
-        <w:rPr>
-          <w:lang w:val="en-US"/>
-        </w:rPr>
-        <w:t>, and is the authority when it comes to taxonomic ID</w:t>
-      </w:r>
-      <w:r>
-        <w:rPr>
-          <w:lang w:val="en-US"/>
-        </w:rPr>
-        <w:t xml:space="preserve">. </w:t>
+        <w:t>An algal taxonomist working as a research assistant at the Kinneret Limnological Institute, Israel Oceanographic and Limnological Research since 2011. She is the analyst conducting the Kinneret phytoplankton counts and measurements since January 2013, has taken nearly all the microscope photos presented in this atlas, and is the authority when it comes to taxonomic ID.</w:t>
+      </w:r>
+      <w:r>
+        <w:rPr>
+          <w:lang w:val="en-US"/>
+        </w:rPr>
+      </w:r>
+      <w:r>
+        <w:rPr>
+          <w:lang w:val="en-US"/>
+        </w:rPr>
+      </w:r>
+      <w:r>
+        <w:rPr>
+          <w:lang w:val="en-US"/>
+        </w:rPr>
+      </w:r>
+      <w:r>
+        <w:rPr>
+          <w:lang w:val="en-US"/>
+        </w:rPr>
+      </w:r>
+      <w:r>
+        <w:rPr>
+          <w:lang w:val="en-US"/>
+        </w:rPr>
+      </w:r>
+      <w:r>
+        <w:rPr>
+          <w:lang w:val="en-US"/>
+        </w:rPr>
+      </w:r>
+      <w:r>
+        <w:rPr>
+          <w:lang w:val="en-US"/>
+        </w:rPr>
+      </w:r>
+      <w:r>
+        <w:rPr>
+          <w:lang w:val="en-US"/>
+        </w:rPr>
+      </w:r>
+      <w:r>
+        <w:rPr>
+          <w:lang w:val="en-US"/>
+        </w:rPr>
+      </w:r>
+      <w:r>
+        <w:rPr>
+          <w:lang w:val="en-US"/>
+        </w:rPr>
+      </w:r>
+      <w:r>
+        <w:rPr>
+          <w:lang w:val="en-US"/>
+        </w:rPr>
+      </w:r>
+      <w:r>
+        <w:rPr>
+          <w:lang w:val="en-US"/>
+        </w:rPr>
+      </w:r>
+      <w:r>
+        <w:rPr>
+          <w:lang w:val="en-US"/>
+        </w:rPr>
+      </w:r>
+      <w:r>
+        <w:rPr>
+          <w:lang w:val="en-US"/>
+        </w:rPr>
       </w:r>
     </w:p>
     <w:p>
@@ -1247,7 +1217,7 @@
           <w:bCs/>
           <w:lang w:val="en-US"/>
         </w:rPr>
-        <w:t>Gal Cohensius</w:t>
+        <w:t>Dr. Gal Cohensius</w:t>
       </w:r>
     </w:p>
     <w:p>
@@ -1257,7 +1227,7 @@
         </w:rPr>
       </w:pPr>
       <w:r>
-        <w:t>Dr. Gal Cohensius is a data scientist with a PhD in Game Theory and AI from the Technion. He built this atlas as a gift to his mom.</w:t>
+        <w:t>A data scientist with a PhD in Game Theory and AI from the Technion. He built this atlas as a gift to his mom.</w:t>
       </w:r>
       <w:r>
         <w:rPr>

</xml_diff>